<commit_message>
fix(analysis): correct two-sample bootstrap CI for Cliff's delta (5A/5B) + relabel Table 8E value column
Final-review blockers: (1) bootstrap_ci was resampling the label vector and
partitioning the pooled array by an arbitrary mask (permutation-style null,
CIs did not bracket the delta point estimate) — replaced with a proper
two-sample percentile bootstrap (_delta_ci, seed=42). (2) qual_quant_link
emitted 1-7 Likert satisfaction medians under the price_median key —
renamed the value column to value_median (link column disambiguates).
</commit_message>
<xml_diff>
--- a/docs/reports/2026-05-15-human-pilot-data-report.docx
+++ b/docs/reports/2026-05-15-human-pilot-data-report.docx
@@ -4843,7 +4843,7 @@
               <w:rPr>
                 <w:sz w:val="18"/>
               </w:rPr>
-              <w:t>-0.369</w:t>
+              <w:t>-0.538</w:t>
             </w:r>
           </w:p>
         </w:tc>
@@ -4857,7 +4857,7 @@
               <w:rPr>
                 <w:sz w:val="18"/>
               </w:rPr>
-              <w:t>0.411</w:t>
+              <w:t>0.2</w:t>
             </w:r>
           </w:p>
         </w:tc>
@@ -4957,7 +4957,7 @@
               <w:rPr>
                 <w:sz w:val="18"/>
               </w:rPr>
-              <w:t>-0.351</w:t>
+              <w:t>-0.43</w:t>
             </w:r>
           </w:p>
         </w:tc>
@@ -4971,7 +4971,7 @@
               <w:rPr>
                 <w:sz w:val="18"/>
               </w:rPr>
-              <w:t>0.394</w:t>
+              <w:t>0.263</w:t>
             </w:r>
           </w:p>
         </w:tc>
@@ -5071,7 +5071,7 @@
               <w:rPr>
                 <w:sz w:val="18"/>
               </w:rPr>
-              <w:t>-0.343</w:t>
+              <w:t>-0.308</w:t>
             </w:r>
           </w:p>
         </w:tc>
@@ -5085,7 +5085,7 @@
               <w:rPr>
                 <w:sz w:val="18"/>
               </w:rPr>
-              <w:t>0.363</w:t>
+              <w:t>0.393</w:t>
             </w:r>
           </w:p>
         </w:tc>
@@ -5185,7 +5185,7 @@
               <w:rPr>
                 <w:sz w:val="18"/>
               </w:rPr>
-              <w:t>-0.348</w:t>
+              <w:t>-0.45</w:t>
             </w:r>
           </w:p>
         </w:tc>
@@ -5199,7 +5199,7 @@
               <w:rPr>
                 <w:sz w:val="18"/>
               </w:rPr>
-              <w:t>0.399</w:t>
+              <w:t>0.323</w:t>
             </w:r>
           </w:p>
         </w:tc>
@@ -5299,7 +5299,7 @@
               <w:rPr>
                 <w:sz w:val="18"/>
               </w:rPr>
-              <w:t>-0.36</w:t>
+              <w:t>-0.308</w:t>
             </w:r>
           </w:p>
         </w:tc>
@@ -5313,7 +5313,7 @@
               <w:rPr>
                 <w:sz w:val="18"/>
               </w:rPr>
-              <w:t>0.396</w:t>
+              <w:t>0.43</w:t>
             </w:r>
           </w:p>
         </w:tc>
@@ -5413,7 +5413,7 @@
               <w:rPr>
                 <w:sz w:val="18"/>
               </w:rPr>
-              <w:t>-0.353</w:t>
+              <w:t>-0.103</w:t>
             </w:r>
           </w:p>
         </w:tc>
@@ -5427,7 +5427,7 @@
               <w:rPr>
                 <w:sz w:val="18"/>
               </w:rPr>
-              <w:t>0.373</w:t>
+              <w:t>0.585</w:t>
             </w:r>
           </w:p>
         </w:tc>
@@ -5527,7 +5527,7 @@
               <w:rPr>
                 <w:sz w:val="18"/>
               </w:rPr>
-              <w:t>-0.376</w:t>
+              <w:t>-0.675</w:t>
             </w:r>
           </w:p>
         </w:tc>
@@ -5541,7 +5541,7 @@
               <w:rPr>
                 <w:sz w:val="18"/>
               </w:rPr>
-              <w:t>0.353</w:t>
+              <w:t>-0.05</w:t>
             </w:r>
           </w:p>
         </w:tc>
@@ -5641,7 +5641,7 @@
               <w:rPr>
                 <w:sz w:val="18"/>
               </w:rPr>
-              <w:t>-0.333</w:t>
+              <w:t>-0.475</w:t>
             </w:r>
           </w:p>
         </w:tc>
@@ -5655,7 +5655,7 @@
               <w:rPr>
                 <w:sz w:val="18"/>
               </w:rPr>
-              <w:t>0.335</w:t>
+              <w:t>0.18</w:t>
             </w:r>
           </w:p>
         </w:tc>
@@ -5755,7 +5755,7 @@
               <w:rPr>
                 <w:sz w:val="18"/>
               </w:rPr>
-              <w:t>-0.354</w:t>
+              <w:t>-0.463</w:t>
             </w:r>
           </w:p>
         </w:tc>
@@ -5769,7 +5769,7 @@
               <w:rPr>
                 <w:sz w:val="18"/>
               </w:rPr>
-              <w:t>0.369</w:t>
+              <w:t>0.265</w:t>
             </w:r>
           </w:p>
         </w:tc>
@@ -6103,7 +6103,7 @@
               <w:rPr>
                 <w:sz w:val="18"/>
               </w:rPr>
-              <w:t>-0.354</w:t>
+              <w:t>-0.678</w:t>
             </w:r>
           </w:p>
         </w:tc>
@@ -6117,7 +6117,7 @@
               <w:rPr>
                 <w:sz w:val="18"/>
               </w:rPr>
-              <w:t>0.356</w:t>
+              <w:t>-0.032</w:t>
             </w:r>
           </w:p>
         </w:tc>
@@ -6217,7 +6217,7 @@
               <w:rPr>
                 <w:sz w:val="18"/>
               </w:rPr>
-              <w:t>-0.366</w:t>
+              <w:t>-0.573</w:t>
             </w:r>
           </w:p>
         </w:tc>
@@ -6231,7 +6231,7 @@
               <w:rPr>
                 <w:sz w:val="18"/>
               </w:rPr>
-              <w:t>0.381</w:t>
+              <w:t>0.093</w:t>
             </w:r>
           </w:p>
         </w:tc>
@@ -6331,7 +6331,7 @@
               <w:rPr>
                 <w:sz w:val="18"/>
               </w:rPr>
-              <w:t>-0.36</w:t>
+              <w:t>-0.468</w:t>
             </w:r>
           </w:p>
         </w:tc>
@@ -6345,7 +6345,7 @@
               <w:rPr>
                 <w:sz w:val="18"/>
               </w:rPr>
-              <w:t>0.343</w:t>
+              <w:t>0.232</w:t>
             </w:r>
           </w:p>
         </w:tc>
@@ -6445,7 +6445,7 @@
               <w:rPr>
                 <w:sz w:val="18"/>
               </w:rPr>
-              <w:t>-0.368</w:t>
+              <w:t>-0.668</w:t>
             </w:r>
           </w:p>
         </w:tc>
@@ -6459,7 +6459,7 @@
               <w:rPr>
                 <w:sz w:val="18"/>
               </w:rPr>
-              <w:t>0.378</w:t>
+              <w:t>-0.027</w:t>
             </w:r>
           </w:p>
         </w:tc>
@@ -6559,7 +6559,7 @@
               <w:rPr>
                 <w:sz w:val="18"/>
               </w:rPr>
-              <w:t>-0.375</w:t>
+              <w:t>-0.548</w:t>
             </w:r>
           </w:p>
         </w:tc>
@@ -6573,7 +6573,7 @@
               <w:rPr>
                 <w:sz w:val="18"/>
               </w:rPr>
-              <w:t>0.362</w:t>
+              <w:t>0.155</w:t>
             </w:r>
           </w:p>
         </w:tc>
@@ -6673,7 +6673,7 @@
               <w:rPr>
                 <w:sz w:val="18"/>
               </w:rPr>
-              <w:t>-0.34</w:t>
+              <w:t>-0.23</w:t>
             </w:r>
           </w:p>
         </w:tc>
@@ -6687,7 +6687,7 @@
               <w:rPr>
                 <w:sz w:val="18"/>
               </w:rPr>
-              <w:t>0.386</w:t>
+              <w:t>0.44</w:t>
             </w:r>
           </w:p>
         </w:tc>
@@ -6787,7 +6787,7 @@
               <w:rPr>
                 <w:sz w:val="18"/>
               </w:rPr>
-              <w:t>-0.366</w:t>
+              <w:t>0.012</w:t>
             </w:r>
           </w:p>
         </w:tc>
@@ -6801,7 +6801,7 @@
               <w:rPr>
                 <w:sz w:val="18"/>
               </w:rPr>
-              <w:t>0.365</w:t>
+              <w:t>0.67</w:t>
             </w:r>
           </w:p>
         </w:tc>
@@ -6901,7 +6901,7 @@
               <w:rPr>
                 <w:sz w:val="18"/>
               </w:rPr>
-              <w:t>-0.348</w:t>
+              <w:t>-0.345</w:t>
             </w:r>
           </w:p>
         </w:tc>
@@ -6915,7 +6915,7 @@
               <w:rPr>
                 <w:sz w:val="18"/>
               </w:rPr>
-              <w:t>0.341</w:t>
+              <w:t>0.335</w:t>
             </w:r>
           </w:p>
         </w:tc>
@@ -7015,7 +7015,7 @@
               <w:rPr>
                 <w:sz w:val="18"/>
               </w:rPr>
-              <w:t>-0.371</w:t>
+              <w:t>-0.505</w:t>
             </w:r>
           </w:p>
         </w:tc>
@@ -7029,7 +7029,7 @@
               <w:rPr>
                 <w:sz w:val="18"/>
               </w:rPr>
-              <w:t>0.35</w:t>
+              <w:t>0.2</w:t>
             </w:r>
           </w:p>
         </w:tc>
@@ -10591,7 +10591,7 @@
                 <w:b/>
                 <w:sz w:val="18"/>
               </w:rPr>
-              <w:t>price_median</w:t>
+              <w:t>value_median</w:t>
             </w:r>
           </w:p>
         </w:tc>

</xml_diff>

<commit_message>
report: align §7 inventory/prose with DV-centric paradigm (final-review minor)
§7 Table 7.1 + prose still advertised the removed per-item δ/FDR + 20-vs-20
contrasts, contradicting the rebuilt §4/§5. Now reflects per-DV SRH 2×2.
Text-only; no statistical change.
</commit_message>
<xml_diff>
--- a/docs/reports/2026-05-15-human-pilot-data-report.docx
+++ b/docs/reports/2026-05-15-human-pilot-data-report.docx
@@ -10114,7 +10114,7 @@
               <w:rPr>
                 <w:sz w:val="18"/>
               </w:rPr>
-              <w:t>descriptive + 20v20 exploratory test</w:t>
+              <w:t>descriptive + per-DV SRH 2×2 (exploratory)</w:t>
             </w:r>
           </w:p>
         </w:tc>
@@ -10172,7 +10172,7 @@
               <w:rPr>
                 <w:sz w:val="18"/>
               </w:rPr>
-              <w:t>descriptive + 20v20 exploratory test</w:t>
+              <w:t>descriptive + per-DV SRH 2×2 (exploratory)</w:t>
             </w:r>
           </w:p>
         </w:tc>
@@ -10318,7 +10318,7 @@
               <w:rPr>
                 <w:sz w:val="18"/>
               </w:rPr>
-              <w:t>9 survey items</w:t>
+              <w:t>9 survey DVs</w:t>
             </w:r>
           </w:p>
         </w:tc>
@@ -10346,7 +10346,7 @@
               <w:rPr>
                 <w:sz w:val="18"/>
               </w:rPr>
-              <w:t>per-item δ + CI, FDR (exploratory)</w:t>
+              <w:t>rainclouds + per-DV SRH 2×2 by 4 cells (exploratory)</w:t>
             </w:r>
           </w:p>
         </w:tc>
@@ -10360,7 +10360,7 @@
               <w:rPr>
                 <w:sz w:val="18"/>
               </w:rPr>
-              <w:t>powered item tests + subscales</w:t>
+              <w:t>powered DV tests + subscales</w:t>
             </w:r>
           </w:p>
         </w:tc>
@@ -10430,7 +10430,7 @@
         <w:rPr>
           <w:i w:val="0"/>
         </w:rPr>
-        <w:t>At current N the report supports descriptives + the two 20-vs-20 exploratory contrasts. Powered cell-level and 3-way analyses require a larger sample.</w:t>
+        <w:t>At current N the report supports descriptives + per-DV Scheirer–Ray–Hare 2×2 (exploratory). Powered cell-level and 3-way analyses require a larger sample.</w:t>
       </w:r>
     </w:p>
     <w:p>

</xml_diff>